<commit_message>
punto 5 terminado :rocket:
</commit_message>
<xml_diff>
--- a/entrega_2/docs/Documentación Entrega 2.docx
+++ b/entrega_2/docs/Documentación Entrega 2.docx
@@ -1994,7 +1994,14 @@
           <w:b/>
           <w:lang w:val="es-ES"/>
         </w:rPr>
-        <w:t>CQ8 – Recomendación por características musicales</w:t>
+        <w:t xml:space="preserve">CQ8 – </w:t>
+      </w:r>
+      <w:r>
+        <w:rPr>
+          <w:b/>
+          <w:lang w:val="es-ES"/>
+        </w:rPr>
+        <w:t>Creadores de canciones</w:t>
       </w:r>
     </w:p>
     <w:p>
@@ -2014,7 +2021,19 @@
         <w:rPr>
           <w:lang w:val="es-ES"/>
         </w:rPr>
-        <w:t>¿Qué canciones tienen características musicales similares a una canción que le gusta al usuario?</w:t>
+        <w:t>¿</w:t>
+      </w:r>
+      <w:r>
+        <w:t>Quiénes</w:t>
+      </w:r>
+      <w:r>
+        <w:t xml:space="preserve"> son los creadores de las canciones del catálogo, considerando que los artistas que las interpretan también se consideran creadores según la ontología</w:t>
+      </w:r>
+      <w:r>
+        <w:rPr>
+          <w:lang w:val="es-ES"/>
+        </w:rPr>
+        <w:t>?</w:t>
       </w:r>
     </w:p>
     <w:p>
@@ -2031,18 +2050,16 @@
         <w:t xml:space="preserve">Descripción: </w:t>
       </w:r>
       <w:r>
-        <w:rPr>
-          <w:lang w:val="es-ES"/>
-        </w:rPr>
-        <w:t>Permite buscar canciones usando atributos como tonalidad, escala, duración, año y frecuencia de afinación.</w:t>
-      </w:r>
-    </w:p>
-    <w:p>
-      <w:pPr>
-        <w:rPr>
-          <w:lang w:val="es-ES"/>
-        </w:rPr>
-      </w:pPr>
+        <w:t>Identifica los creadores de las canciones a partir de los artistas que las interpretan</w:t>
+      </w:r>
+      <w:r>
+        <w:rPr>
+          <w:lang w:val="es-ES"/>
+        </w:rPr>
+        <w:t>.</w:t>
+      </w:r>
+    </w:p>
+    <w:p>
       <w:r>
         <w:rPr>
           <w:b/>
@@ -2051,12 +2068,180 @@
         <w:t xml:space="preserve">Justificación: </w:t>
       </w:r>
       <w:r>
-        <w:rPr>
-          <w:lang w:val="es-ES"/>
-        </w:rPr>
-        <w:t>Comprueba que los atributos musicales puedan utilizarse para recomendaciones.</w:t>
-      </w:r>
-    </w:p>
+        <w:t xml:space="preserve">Demuestra la inferencia RDFS mediante la relación </w:t>
+      </w:r>
+      <w:proofErr w:type="gramStart"/>
+      <w:r>
+        <w:t>rdfs:subPropertyOf</w:t>
+      </w:r>
+      <w:proofErr w:type="gramEnd"/>
+      <w:r>
+        <w:t xml:space="preserve"> entre </w:t>
+      </w:r>
+      <w:proofErr w:type="gramStart"/>
+      <w:r>
+        <w:t>rbo:sungBy</w:t>
+      </w:r>
+      <w:proofErr w:type="gramEnd"/>
+      <w:r>
+        <w:t xml:space="preserve"> y </w:t>
+      </w:r>
+      <w:proofErr w:type="gramStart"/>
+      <w:r>
+        <w:t>rbo:createdBy</w:t>
+      </w:r>
+      <w:proofErr w:type="gramEnd"/>
+      <w:r>
+        <w:t>.</w:t>
+      </w:r>
+    </w:p>
+    <w:p/>
+    <w:p>
+      <w:pPr>
+        <w:rPr>
+          <w:lang w:val="es-ES"/>
+        </w:rPr>
+      </w:pPr>
+      <w:r>
+        <w:rPr>
+          <w:b/>
+          <w:lang w:val="es-ES"/>
+        </w:rPr>
+        <w:t>CQ</w:t>
+      </w:r>
+      <w:r>
+        <w:rPr>
+          <w:b/>
+          <w:lang w:val="es-ES"/>
+        </w:rPr>
+        <w:t>9</w:t>
+      </w:r>
+      <w:r>
+        <w:rPr>
+          <w:b/>
+          <w:lang w:val="es-ES"/>
+        </w:rPr>
+        <w:t xml:space="preserve"> – </w:t>
+      </w:r>
+      <w:r>
+        <w:rPr>
+          <w:b/>
+          <w:lang w:val="es-ES"/>
+        </w:rPr>
+        <w:t>Encontrar el origen de las canciones</w:t>
+      </w:r>
+    </w:p>
+    <w:p>
+      <w:pPr>
+        <w:rPr>
+          <w:lang w:val="es-ES"/>
+        </w:rPr>
+      </w:pPr>
+      <w:r>
+        <w:rPr>
+          <w:b/>
+          <w:lang w:val="es-ES"/>
+        </w:rPr>
+        <w:t xml:space="preserve">Pregunta: </w:t>
+      </w:r>
+      <w:r>
+        <w:rPr>
+          <w:lang w:val="es-ES"/>
+        </w:rPr>
+        <w:t>¿</w:t>
+      </w:r>
+      <w:r>
+        <w:t>Qué</w:t>
+      </w:r>
+      <w:r>
+        <w:t xml:space="preserve"> país se asocia a cada canción según el país de origen del artista que la interpreta</w:t>
+      </w:r>
+      <w:r>
+        <w:rPr>
+          <w:lang w:val="es-ES"/>
+        </w:rPr>
+        <w:t>?</w:t>
+      </w:r>
+    </w:p>
+    <w:p>
+      <w:pPr>
+        <w:rPr>
+          <w:lang w:val="es-ES"/>
+        </w:rPr>
+      </w:pPr>
+      <w:r>
+        <w:rPr>
+          <w:b/>
+          <w:lang w:val="es-ES"/>
+        </w:rPr>
+        <w:t xml:space="preserve">Descripción: </w:t>
+      </w:r>
+      <w:r>
+        <w:rPr>
+          <w:b/>
+          <w:lang w:val="es-ES"/>
+        </w:rPr>
+        <w:t>I</w:t>
+      </w:r>
+      <w:r>
+        <w:t>dentifica el país asociado a cada canción a partir del país de origen del artista que la interpreta</w:t>
+      </w:r>
+    </w:p>
+    <w:p>
+      <w:r>
+        <w:rPr>
+          <w:b/>
+          <w:lang w:val="es-ES"/>
+        </w:rPr>
+        <w:lastRenderedPageBreak/>
+        <w:t xml:space="preserve">Justificación: </w:t>
+      </w:r>
+      <w:r>
+        <w:t xml:space="preserve">Evalúa la inferencia OWL mediante </w:t>
+      </w:r>
+      <w:r>
+        <w:rPr>
+          <w:rStyle w:val="HTMLCode"/>
+          <w:rFonts w:eastAsiaTheme="minorHAnsi"/>
+        </w:rPr>
+        <w:t>owl:propertyChainAxiom</w:t>
+      </w:r>
+      <w:r>
+        <w:t xml:space="preserve">, combinando las propiedades </w:t>
+      </w:r>
+      <w:r>
+        <w:rPr>
+          <w:rStyle w:val="HTMLCode"/>
+          <w:rFonts w:eastAsiaTheme="minorHAnsi"/>
+        </w:rPr>
+        <w:t>rbo:sungBy</w:t>
+      </w:r>
+      <w:r>
+        <w:t xml:space="preserve"> y </w:t>
+      </w:r>
+      <w:r>
+        <w:rPr>
+          <w:rStyle w:val="HTMLCode"/>
+          <w:rFonts w:eastAsiaTheme="minorHAnsi"/>
+        </w:rPr>
+        <w:t>rbo:origin</w:t>
+      </w:r>
+      <w:r>
+        <w:t xml:space="preserve"> para inferir </w:t>
+      </w:r>
+      <w:r>
+        <w:rPr>
+          <w:rStyle w:val="HTMLCode"/>
+          <w:rFonts w:eastAsiaTheme="minorHAnsi"/>
+        </w:rPr>
+        <w:t>rbo:sungInCountry</w:t>
+      </w:r>
+      <w:r>
+        <w:t>.</w:t>
+      </w:r>
+    </w:p>
+    <w:p/>
+    <w:p/>
     <w:p>
       <w:pPr>
         <w:rPr>
@@ -2144,7 +2329,6 @@
         <w:rPr>
           <w:lang w:val="es-ES"/>
         </w:rPr>
-        <w:lastRenderedPageBreak/>
         <w:t>Punto 4</w:t>
       </w:r>
     </w:p>
@@ -2385,6 +2569,7 @@
           <w:noProof/>
           <w:lang w:val="es-ES"/>
         </w:rPr>
+        <w:lastRenderedPageBreak/>
         <w:drawing>
           <wp:inline distT="0" distB="0" distL="0" distR="0" wp14:anchorId="0F96B00D" wp14:editId="22ECA4F6">
             <wp:extent cx="5321300" cy="889000"/>
@@ -2507,7 +2692,6 @@
         <w:rPr>
           <w:lang w:val="es-ES"/>
         </w:rPr>
-        <w:lastRenderedPageBreak/>
         <w:t xml:space="preserve">Cargar </w:t>
       </w:r>
       <w:proofErr w:type="spellStart"/>
@@ -2599,6 +2783,7 @@
           <w:noProof/>
           <w:lang w:val="es-ES"/>
         </w:rPr>
+        <w:lastRenderedPageBreak/>
         <w:drawing>
           <wp:inline distT="0" distB="0" distL="0" distR="0" wp14:anchorId="1EA75B11" wp14:editId="5A3FAF4D">
             <wp:extent cx="4276436" cy="2988023"/>
@@ -2660,7 +2845,6 @@
           <w:noProof/>
           <w:lang w:val="es-ES"/>
         </w:rPr>
-        <w:lastRenderedPageBreak/>
         <w:drawing>
           <wp:inline distT="0" distB="0" distL="0" distR="0" wp14:anchorId="32F989D1" wp14:editId="2879D2A4">
             <wp:extent cx="5943600" cy="3823335"/>
@@ -3894,6 +4078,19 @@
       </w:tblBorders>
     </w:tblPr>
   </w:style>
+  <w:style w:type="character" w:styleId="HTMLCode">
+    <w:name w:val="HTML Code"/>
+    <w:basedOn w:val="DefaultParagraphFont"/>
+    <w:uiPriority w:val="99"/>
+    <w:semiHidden/>
+    <w:unhideWhenUsed/>
+    <w:rsid w:val="009414F4"/>
+    <w:rPr>
+      <w:rFonts w:ascii="Courier New" w:eastAsia="Times New Roman" w:hAnsi="Courier New" w:cs="Courier New"/>
+      <w:sz w:val="20"/>
+      <w:szCs w:val="20"/>
+    </w:rPr>
+  </w:style>
 </w:styles>
 </file>
 

</xml_diff>